<commit_message>
All 5 challenges in part 1 complete
</commit_message>
<xml_diff>
--- a/CST-250 Activity Template.docx
+++ b/CST-250 Activity Template.docx
@@ -72,36 +72,34 @@
           <w:sz w:val="46"/>
           <w:szCs w:val="46"/>
         </w:rPr>
-        <w:t>June 01, 2025</w:t>
-      </w:r>
-    </w:p>
-    <w:p>
-      <w:pPr>
-        <w:jc w:val="center"/>
-      </w:pPr>
+        <w:t>Nov. 09</w:t>
+      </w:r>
       <w:r>
         <w:rPr>
           <w:sz w:val="46"/>
           <w:szCs w:val="46"/>
         </w:rPr>
-        <w:t xml:space="preserve">Activity </w:t>
-      </w:r>
+        <w:t>, 2025</w:t>
+      </w:r>
+    </w:p>
+    <w:p>
+      <w:pPr>
+        <w:jc w:val="center"/>
+      </w:pPr>
       <w:r>
         <w:rPr>
           <w:sz w:val="46"/>
           <w:szCs w:val="46"/>
         </w:rPr>
-        <w:t>1</w:t>
-      </w:r>
-    </w:p>
-    <w:p>
-      <w:pPr>
-        <w:jc w:val="center"/>
+        <w:t xml:space="preserve">Activity </w:t>
+      </w:r>
+      <w:r>
         <w:rPr>
           <w:sz w:val="46"/>
           <w:szCs w:val="46"/>
         </w:rPr>
-      </w:pPr>
+        <w:t>#</w:t>
+      </w:r>
     </w:p>
     <w:p>
       <w:pPr>
@@ -111,39 +109,22 @@
           <w:szCs w:val="46"/>
         </w:rPr>
       </w:pPr>
-      <w:r>
+    </w:p>
+    <w:p>
+      <w:pPr>
+        <w:jc w:val="center"/>
         <w:rPr>
           <w:sz w:val="46"/>
           <w:szCs w:val="46"/>
         </w:rPr>
-        <w:t>Files</w:t>
-      </w:r>
-    </w:p>
-    <w:p>
-      <w:pPr>
-        <w:jc w:val="center"/>
-      </w:pPr>
-      <w:hyperlink r:id="rId5">
-        <w:r>
-          <w:rPr>
-            <w:rStyle w:val="Hyperlink"/>
-            <w:sz w:val="46"/>
-            <w:szCs w:val="46"/>
-            <w:lang w:val="en-US"/>
-          </w:rPr>
-          <w:t>https://github.com/CGalloway3/CST-150/tree/main/Activity%202</w:t>
-        </w:r>
-      </w:hyperlink>
-    </w:p>
-    <w:p>
-      <w:pPr>
-        <w:jc w:val="center"/>
+      </w:pPr>
+      <w:r>
         <w:rPr>
           <w:sz w:val="46"/>
           <w:szCs w:val="46"/>
-          <w:lang w:val="en-US"/>
-        </w:rPr>
-      </w:pPr>
+        </w:rPr>
+        <w:t>Files</w:t>
+      </w:r>
     </w:p>
     <w:p>
       <w:pPr>
@@ -160,7 +141,7 @@
           <w:szCs w:val="46"/>
           <w:lang w:val="en-US"/>
         </w:rPr>
-        <w:t>Video</w:t>
+        <w:t>[Files Link]</w:t>
       </w:r>
     </w:p>
     <w:p>
@@ -169,22 +150,50 @@
         <w:rPr>
           <w:sz w:val="46"/>
           <w:szCs w:val="46"/>
-        </w:rPr>
-      </w:pPr>
-      <w:r>
+          <w:lang w:val="en-US"/>
+        </w:rPr>
+      </w:pPr>
+    </w:p>
+    <w:p>
+      <w:pPr>
+        <w:jc w:val="center"/>
         <w:rPr>
           <w:sz w:val="46"/>
           <w:szCs w:val="46"/>
-        </w:rPr>
-        <w:t>[Video Link]</w:t>
-      </w:r>
-    </w:p>
-    <w:p>
-      <w:pPr>
-        <w:jc w:val="center"/>
+          <w:lang w:val="en-US"/>
+        </w:rPr>
+      </w:pPr>
+      <w:r>
         <w:rPr>
           <w:sz w:val="46"/>
           <w:szCs w:val="46"/>
+          <w:lang w:val="en-US"/>
+        </w:rPr>
+        <w:t>Video</w:t>
+      </w:r>
+    </w:p>
+    <w:p>
+      <w:pPr>
+        <w:jc w:val="center"/>
+        <w:rPr>
+          <w:sz w:val="46"/>
+          <w:szCs w:val="46"/>
+        </w:rPr>
+      </w:pPr>
+      <w:r>
+        <w:rPr>
+          <w:sz w:val="46"/>
+          <w:szCs w:val="46"/>
+        </w:rPr>
+        <w:t>[Video Link]</w:t>
+      </w:r>
+    </w:p>
+    <w:p>
+      <w:pPr>
+        <w:jc w:val="center"/>
+        <w:rPr>
+          <w:sz w:val="46"/>
+          <w:szCs w:val="46"/>
         </w:rPr>
       </w:pPr>
     </w:p>
@@ -195,20 +204,45 @@
         <w:br w:type="page"/>
       </w:r>
     </w:p>
-    <w:p>
-      <w:pPr>
-        <w:jc w:val="center"/>
-        <w:rPr>
-          <w:sz w:val="28"/>
-          <w:szCs w:val="28"/>
-        </w:rPr>
-      </w:pPr>
-      <w:r>
-        <w:rPr>
-          <w:sz w:val="28"/>
-          <w:szCs w:val="28"/>
-        </w:rPr>
-        <w:lastRenderedPageBreak/>
+    <w:p/>
+    <w:p>
+      <w:pPr>
+        <w:jc w:val="center"/>
+        <w:rPr>
+          <w:b/>
+          <w:sz w:val="28"/>
+          <w:szCs w:val="28"/>
+        </w:rPr>
+      </w:pPr>
+      <w:r>
+        <w:rPr>
+          <w:b/>
+          <w:sz w:val="28"/>
+          <w:szCs w:val="28"/>
+        </w:rPr>
+        <w:t>Part 1</w:t>
+      </w:r>
+    </w:p>
+    <w:p>
+      <w:pPr>
+        <w:rPr>
+          <w:lang w:val="en-US"/>
+        </w:rPr>
+      </w:pPr>
+    </w:p>
+    <w:p>
+      <w:pPr>
+        <w:jc w:val="center"/>
+        <w:rPr>
+          <w:sz w:val="28"/>
+          <w:szCs w:val="28"/>
+        </w:rPr>
+      </w:pPr>
+      <w:r>
+        <w:rPr>
+          <w:sz w:val="28"/>
+          <w:szCs w:val="28"/>
+        </w:rPr>
         <w:t>FLOW CHART</w:t>
       </w:r>
     </w:p>
@@ -230,7 +264,7 @@
           <w:noProof/>
         </w:rPr>
         <w:drawing>
-          <wp:inline distT="114300" distB="114300" distL="114300" distR="114300" wp14:anchorId="626C9FE5" wp14:editId="07777777">
+          <wp:inline distT="114300" distB="114300" distL="114300" distR="114300" wp14:anchorId="6B917D24" wp14:editId="477ABEFF">
             <wp:extent cx="3148013" cy="1796373"/>
             <wp:effectExtent l="0" t="0" r="0" b="0"/>
             <wp:docPr id="1" name="image1.jpg"/>
@@ -243,7 +277,7 @@
                     <pic:cNvPicPr preferRelativeResize="0"/>
                   </pic:nvPicPr>
                   <pic:blipFill>
-                    <a:blip r:embed="rId6"/>
+                    <a:blip r:embed="rId5"/>
                     <a:srcRect/>
                     <a:stretch>
                       <a:fillRect/>
@@ -327,7 +361,7 @@
           <w:noProof/>
         </w:rPr>
         <w:drawing>
-          <wp:inline distT="114300" distB="114300" distL="114300" distR="114300" wp14:anchorId="3AD8A525" wp14:editId="07777777">
+          <wp:inline distT="114300" distB="114300" distL="114300" distR="114300" wp14:anchorId="4AFE0C49" wp14:editId="0F2A2995">
             <wp:extent cx="3148013" cy="1796373"/>
             <wp:effectExtent l="0" t="0" r="0" b="0"/>
             <wp:docPr id="6" name="image1.jpg"/>
@@ -340,7 +374,7 @@
                     <pic:cNvPicPr preferRelativeResize="0"/>
                   </pic:nvPicPr>
                   <pic:blipFill>
-                    <a:blip r:embed="rId6"/>
+                    <a:blip r:embed="rId5"/>
                     <a:srcRect/>
                     <a:stretch>
                       <a:fillRect/>
@@ -397,28 +431,38 @@
       </w:r>
     </w:p>
     <w:p>
+      <w:pPr>
+        <w:jc w:val="center"/>
+      </w:pPr>
       <w:r>
         <w:br w:type="page"/>
       </w:r>
     </w:p>
-    <w:p/>
-    <w:p>
-      <w:pPr>
-        <w:jc w:val="center"/>
-        <w:rPr>
-          <w:b/>
-          <w:sz w:val="28"/>
-          <w:szCs w:val="28"/>
-        </w:rPr>
-      </w:pPr>
-      <w:r>
-        <w:rPr>
-          <w:b/>
-          <w:sz w:val="28"/>
-          <w:szCs w:val="28"/>
-        </w:rPr>
-        <w:t>Part 1</w:t>
-      </w:r>
+    <w:p>
+      <w:pPr>
+        <w:jc w:val="center"/>
+        <w:rPr>
+          <w:sz w:val="28"/>
+          <w:szCs w:val="28"/>
+        </w:rPr>
+      </w:pPr>
+      <w:r>
+        <w:rPr>
+          <w:sz w:val="28"/>
+          <w:szCs w:val="28"/>
+        </w:rPr>
+        <w:lastRenderedPageBreak/>
+        <w:t>Screen Shots</w:t>
+      </w:r>
+    </w:p>
+    <w:p>
+      <w:pPr>
+        <w:jc w:val="center"/>
+        <w:rPr>
+          <w:sz w:val="28"/>
+          <w:szCs w:val="28"/>
+        </w:rPr>
+      </w:pPr>
     </w:p>
     <w:p>
       <w:pPr>
@@ -429,7 +473,7 @@
           <w:noProof/>
         </w:rPr>
         <w:drawing>
-          <wp:inline distT="114300" distB="114300" distL="114300" distR="114300" wp14:anchorId="4B9CBEB9" wp14:editId="07777777">
+          <wp:inline distT="114300" distB="114300" distL="114300" distR="114300" wp14:anchorId="05AB9AB9" wp14:editId="235B7011">
             <wp:extent cx="3148013" cy="1796373"/>
             <wp:effectExtent l="0" t="0" r="0" b="0"/>
             <wp:docPr id="3" name="image1.jpg"/>
@@ -442,7 +486,7 @@
                     <pic:cNvPicPr preferRelativeResize="0"/>
                   </pic:nvPicPr>
                   <pic:blipFill>
-                    <a:blip r:embed="rId6"/>
+                    <a:blip r:embed="rId5"/>
                     <a:srcRect/>
                     <a:stretch>
                       <a:fillRect/>
@@ -479,6 +523,11 @@
       </w:pPr>
     </w:p>
     <w:p>
+      <w:pPr>
+        <w:rPr>
+          <w:lang w:val="en-US"/>
+        </w:rPr>
+      </w:pPr>
       <w:r>
         <w:rPr>
           <w:lang w:val="en-US"/>
@@ -486,9 +535,6 @@
         <w:t xml:space="preserve">Lorem ipsum dolor sit amet, consectetur adipiscing elit, sed do eiusmod tempor incididunt ut labore et dolore magna aliqua. </w:t>
       </w:r>
       <w:r>
-        <w:rPr>
-          <w:lang w:val="pt-BR"/>
-        </w:rPr>
         <w:t xml:space="preserve">Ut enim ad minim veniam, quis nostrud exercitation ullamco laboris nisi ut aliquip ex ea commodo consequat. </w:t>
       </w:r>
       <w:r>
@@ -498,27 +544,16 @@
         <w:t>Duis aute irure dolor in reprehenderit in voluptate velit esse cillum dolore eu fugiat nulla pariatur. Excepteur sint occaecat cupidatat non proident, sunt in culpa qui officia deserunt mollit anim id est laborum.</w:t>
       </w:r>
     </w:p>
-    <w:p>
-      <w:r>
-        <w:br w:type="page"/>
-      </w:r>
-    </w:p>
-    <w:p/>
-    <w:p>
-      <w:pPr>
-        <w:jc w:val="center"/>
-        <w:rPr>
-          <w:sz w:val="28"/>
-          <w:szCs w:val="28"/>
-        </w:rPr>
-      </w:pPr>
-      <w:r>
-        <w:rPr>
-          <w:sz w:val="28"/>
-          <w:szCs w:val="28"/>
-        </w:rPr>
-        <w:t>Part 2</w:t>
-      </w:r>
+    <w:p/>
+    <w:p/>
+    <w:p>
+      <w:pPr>
+        <w:jc w:val="center"/>
+        <w:rPr>
+          <w:sz w:val="28"/>
+          <w:szCs w:val="28"/>
+        </w:rPr>
+      </w:pPr>
     </w:p>
     <w:p>
       <w:pPr>
@@ -529,10 +564,10 @@
           <w:noProof/>
         </w:rPr>
         <w:drawing>
-          <wp:inline distT="114300" distB="114300" distL="114300" distR="114300" wp14:anchorId="2012B95D" wp14:editId="07777777">
+          <wp:inline distT="114300" distB="114300" distL="114300" distR="114300" wp14:anchorId="6D4325D3" wp14:editId="440EF182">
             <wp:extent cx="3148013" cy="1796373"/>
             <wp:effectExtent l="0" t="0" r="0" b="0"/>
-            <wp:docPr id="2" name="image1.jpg"/>
+            <wp:docPr id="547260474" name="image1.jpg"/>
             <wp:cNvGraphicFramePr/>
             <a:graphic xmlns:a="http://schemas.openxmlformats.org/drawingml/2006/main">
               <a:graphicData uri="http://schemas.openxmlformats.org/drawingml/2006/picture">
@@ -542,7 +577,7 @@
                     <pic:cNvPicPr preferRelativeResize="0"/>
                   </pic:nvPicPr>
                   <pic:blipFill>
-                    <a:blip r:embed="rId6"/>
+                    <a:blip r:embed="rId5"/>
                     <a:srcRect/>
                     <a:stretch>
                       <a:fillRect/>
@@ -570,65 +605,24 @@
         <w:jc w:val="center"/>
       </w:pPr>
       <w:r>
-        <w:t>Figure X: Part 2 App Running</w:t>
-      </w:r>
-    </w:p>
-    <w:p>
-      <w:pPr>
-        <w:jc w:val="center"/>
-      </w:pPr>
-    </w:p>
-    <w:p>
-      <w:r>
-        <w:rPr>
-          <w:lang w:val="en-US"/>
-        </w:rPr>
-        <w:t xml:space="preserve">Lorem ipsum dolor sit amet, consectetur adipiscing elit, sed do eiusmod tempor incididunt ut labore et dolore magna aliqua. </w:t>
-      </w:r>
-      <w:r>
-        <w:rPr>
-          <w:lang w:val="pt-BR"/>
-        </w:rPr>
-        <w:t xml:space="preserve">Ut enim ad minim veniam, quis nostrud exercitation ullamco laboris nisi ut aliquip ex ea commodo consequat. </w:t>
-      </w:r>
-      <w:r>
-        <w:rPr>
-          <w:lang w:val="en-US"/>
-        </w:rPr>
-        <w:t>Duis aute irure dolor in reprehenderit in voluptate velit esse cillum dolore eu fugiat nulla pariatur. Excepteur sint occaecat cupidatat non proident, sunt in culpa qui officia deserunt mollit anim id est laborum.</w:t>
-      </w:r>
-    </w:p>
-    <w:p>
-      <w:r>
-        <w:br w:type="page"/>
-      </w:r>
-    </w:p>
-    <w:p/>
-    <w:p>
-      <w:pPr>
-        <w:jc w:val="center"/>
-        <w:rPr>
-          <w:sz w:val="28"/>
-          <w:szCs w:val="28"/>
-        </w:rPr>
-      </w:pPr>
-      <w:r>
-        <w:rPr>
-          <w:sz w:val="28"/>
-          <w:szCs w:val="28"/>
-        </w:rPr>
-        <w:t>Screen Shots</w:t>
-      </w:r>
-    </w:p>
-    <w:p>
-      <w:pPr>
-        <w:jc w:val="center"/>
-        <w:rPr>
-          <w:sz w:val="28"/>
-          <w:szCs w:val="28"/>
-        </w:rPr>
-      </w:pPr>
-    </w:p>
+        <w:t>Figure X: Screenshot of successful output</w:t>
+      </w:r>
+    </w:p>
+    <w:p>
+      <w:pPr>
+        <w:jc w:val="center"/>
+      </w:pPr>
+    </w:p>
+    <w:p>
+      <w:r>
+        <w:rPr>
+          <w:lang w:val="en-US"/>
+        </w:rPr>
+        <w:t>Lorem ipsum dolor sit amet, consectetur adipiscing elit, sed do eiusmod tempor incididunt ut labore et dolore magna aliqua. Ut enim ad minim veniam, quis nostrud exercitation ullamco laboris nisi ut aliquip ex ea commodo consequat. Duis aute irure dolor in reprehenderit in voluptate velit esse cillum dolore eu fugiat nulla pariatur. Excepteur sint occaecat cupidatat non proident, sunt in culpa qui officia deserunt mollit anim id est laborum.</w:t>
+      </w:r>
+    </w:p>
+    <w:p/>
+    <w:p/>
     <w:p>
       <w:pPr>
         <w:jc w:val="center"/>
@@ -637,11 +631,12 @@
         <w:rPr>
           <w:noProof/>
         </w:rPr>
+        <w:lastRenderedPageBreak/>
         <w:drawing>
-          <wp:inline distT="114300" distB="114300" distL="114300" distR="114300" wp14:anchorId="40ABEC3A" wp14:editId="07777777">
+          <wp:inline distT="114300" distB="114300" distL="114300" distR="114300" wp14:anchorId="0C53EAC3" wp14:editId="0A61E8D9">
             <wp:extent cx="3148013" cy="1796373"/>
             <wp:effectExtent l="0" t="0" r="0" b="0"/>
-            <wp:docPr id="4" name="image1.jpg"/>
+            <wp:docPr id="984152048" name="image1.jpg"/>
             <wp:cNvGraphicFramePr/>
             <a:graphic xmlns:a="http://schemas.openxmlformats.org/drawingml/2006/main">
               <a:graphicData uri="http://schemas.openxmlformats.org/drawingml/2006/picture">
@@ -651,7 +646,7 @@
                     <pic:cNvPicPr preferRelativeResize="0"/>
                   </pic:nvPicPr>
                   <pic:blipFill>
-                    <a:blip r:embed="rId6"/>
+                    <a:blip r:embed="rId5"/>
                     <a:srcRect/>
                     <a:stretch>
                       <a:fillRect/>
@@ -679,7 +674,7 @@
         <w:jc w:val="center"/>
       </w:pPr>
       <w:r>
-        <w:t>Figure X: Screenshot of successful output</w:t>
+        <w:t>Figure X: Screenshot of Error Handling</w:t>
       </w:r>
     </w:p>
     <w:p>
@@ -696,7 +691,70 @@
       </w:r>
     </w:p>
     <w:p/>
-    <w:p/>
+    <w:p>
+      <w:r>
+        <w:br w:type="page"/>
+      </w:r>
+    </w:p>
+    <w:p/>
+    <w:p>
+      <w:pPr>
+        <w:jc w:val="center"/>
+        <w:rPr>
+          <w:b/>
+          <w:sz w:val="28"/>
+          <w:szCs w:val="28"/>
+        </w:rPr>
+      </w:pPr>
+      <w:r>
+        <w:rPr>
+          <w:b/>
+          <w:sz w:val="28"/>
+          <w:szCs w:val="28"/>
+        </w:rPr>
+        <w:t xml:space="preserve">Part </w:t>
+      </w:r>
+      <w:r>
+        <w:rPr>
+          <w:b/>
+          <w:sz w:val="28"/>
+          <w:szCs w:val="28"/>
+        </w:rPr>
+        <w:t>2</w:t>
+      </w:r>
+    </w:p>
+    <w:p>
+      <w:pPr>
+        <w:rPr>
+          <w:lang w:val="en-US"/>
+        </w:rPr>
+      </w:pPr>
+    </w:p>
+    <w:p>
+      <w:pPr>
+        <w:jc w:val="center"/>
+        <w:rPr>
+          <w:sz w:val="28"/>
+          <w:szCs w:val="28"/>
+        </w:rPr>
+      </w:pPr>
+      <w:r>
+        <w:rPr>
+          <w:sz w:val="28"/>
+          <w:szCs w:val="28"/>
+        </w:rPr>
+        <w:t>FLOW CHART</w:t>
+      </w:r>
+    </w:p>
+    <w:p>
+      <w:pPr>
+        <w:jc w:val="center"/>
+        <w:rPr>
+          <w:sz w:val="28"/>
+          <w:szCs w:val="28"/>
+        </w:rPr>
+      </w:pPr>
+    </w:p>
     <w:p>
       <w:pPr>
         <w:jc w:val="center"/>
@@ -706,10 +764,10 @@
           <w:noProof/>
         </w:rPr>
         <w:drawing>
-          <wp:inline distT="114300" distB="114300" distL="114300" distR="114300" wp14:anchorId="5057B89E" wp14:editId="07777777">
+          <wp:inline distT="114300" distB="114300" distL="114300" distR="114300" wp14:anchorId="12BAE9EA" wp14:editId="27AC631E">
             <wp:extent cx="3148013" cy="1796373"/>
             <wp:effectExtent l="0" t="0" r="0" b="0"/>
-            <wp:docPr id="5" name="image1.jpg"/>
+            <wp:docPr id="1672752189" name="image1.jpg"/>
             <wp:cNvGraphicFramePr/>
             <a:graphic xmlns:a="http://schemas.openxmlformats.org/drawingml/2006/main">
               <a:graphicData uri="http://schemas.openxmlformats.org/drawingml/2006/picture">
@@ -719,7 +777,7 @@
                     <pic:cNvPicPr preferRelativeResize="0"/>
                   </pic:nvPicPr>
                   <pic:blipFill>
-                    <a:blip r:embed="rId6"/>
+                    <a:blip r:embed="rId5"/>
                     <a:srcRect/>
                     <a:stretch>
                       <a:fillRect/>
@@ -747,6 +805,384 @@
         <w:jc w:val="center"/>
       </w:pPr>
       <w:r>
+        <w:t>Figure X: Flow chart of XXXXXXX</w:t>
+      </w:r>
+    </w:p>
+    <w:p>
+      <w:pPr>
+        <w:jc w:val="center"/>
+      </w:pPr>
+    </w:p>
+    <w:p>
+      <w:r>
+        <w:rPr>
+          <w:lang w:val="en-US"/>
+        </w:rPr>
+        <w:t>"Lorem ipsum dolor sit amet, consectetur adipiscing elit, sed do eiusmod tempor incididunt ut labore et dolore magna aliqua. Ut enim ad minim veniam, quis nostrud exercitation ullamco laboris nisi ut aliquip ex ea commodo consequat. Duis aute irure dolor in reprehenderit in voluptate velit esse cillum dolore eu fugiat nulla pariatur. Excepteur sint occaecat cupidatat non proident, sunt in culpa qui officia deserunt mollit anim id est laborum."</w:t>
+      </w:r>
+    </w:p>
+    <w:p>
+      <w:r>
+        <w:br w:type="page"/>
+      </w:r>
+    </w:p>
+    <w:p/>
+    <w:p>
+      <w:pPr>
+        <w:jc w:val="center"/>
+        <w:rPr>
+          <w:sz w:val="28"/>
+          <w:szCs w:val="28"/>
+        </w:rPr>
+      </w:pPr>
+      <w:r>
+        <w:rPr>
+          <w:sz w:val="28"/>
+          <w:szCs w:val="28"/>
+        </w:rPr>
+        <w:t>UML Class Diagram</w:t>
+      </w:r>
+    </w:p>
+    <w:p>
+      <w:pPr>
+        <w:jc w:val="center"/>
+        <w:rPr>
+          <w:sz w:val="28"/>
+          <w:szCs w:val="28"/>
+        </w:rPr>
+      </w:pPr>
+    </w:p>
+    <w:p>
+      <w:pPr>
+        <w:jc w:val="center"/>
+      </w:pPr>
+      <w:r>
+        <w:rPr>
+          <w:noProof/>
+        </w:rPr>
+        <w:drawing>
+          <wp:inline distT="114300" distB="114300" distL="114300" distR="114300" wp14:anchorId="1B6336B7" wp14:editId="4836C287">
+            <wp:extent cx="3148013" cy="1796373"/>
+            <wp:effectExtent l="0" t="0" r="0" b="0"/>
+            <wp:docPr id="425721919" name="image1.jpg"/>
+            <wp:cNvGraphicFramePr/>
+            <a:graphic xmlns:a="http://schemas.openxmlformats.org/drawingml/2006/main">
+              <a:graphicData uri="http://schemas.openxmlformats.org/drawingml/2006/picture">
+                <pic:pic xmlns:pic="http://schemas.openxmlformats.org/drawingml/2006/picture">
+                  <pic:nvPicPr>
+                    <pic:cNvPr id="0" name="image1.jpg"/>
+                    <pic:cNvPicPr preferRelativeResize="0"/>
+                  </pic:nvPicPr>
+                  <pic:blipFill>
+                    <a:blip r:embed="rId5"/>
+                    <a:srcRect/>
+                    <a:stretch>
+                      <a:fillRect/>
+                    </a:stretch>
+                  </pic:blipFill>
+                  <pic:spPr>
+                    <a:xfrm>
+                      <a:off x="0" y="0"/>
+                      <a:ext cx="3148013" cy="1796373"/>
+                    </a:xfrm>
+                    <a:prstGeom prst="rect">
+                      <a:avLst/>
+                    </a:prstGeom>
+                    <a:ln/>
+                  </pic:spPr>
+                </pic:pic>
+              </a:graphicData>
+            </a:graphic>
+          </wp:inline>
+        </w:drawing>
+      </w:r>
+    </w:p>
+    <w:p>
+      <w:pPr>
+        <w:jc w:val="center"/>
+      </w:pPr>
+      <w:r>
+        <w:t>Figure X: UML Class Diagram</w:t>
+      </w:r>
+    </w:p>
+    <w:p>
+      <w:pPr>
+        <w:jc w:val="center"/>
+      </w:pPr>
+    </w:p>
+    <w:p>
+      <w:r>
+        <w:rPr>
+          <w:lang w:val="en-US"/>
+        </w:rPr>
+        <w:t xml:space="preserve">Lorem ipsum dolor sit amet, consectetur adipiscing elit, sed do eiusmod tempor incididunt ut labore et dolore magna aliqua. </w:t>
+      </w:r>
+      <w:r>
+        <w:rPr>
+          <w:lang w:val="pt-BR"/>
+        </w:rPr>
+        <w:t xml:space="preserve">Ut enim ad minim veniam, quis nostrud exercitation ullamco laboris nisi ut aliquip ex ea commodo consequat. </w:t>
+      </w:r>
+      <w:r>
+        <w:rPr>
+          <w:lang w:val="en-US"/>
+        </w:rPr>
+        <w:t>Duis aute irure dolor in reprehenderit in voluptate velit esse cillum dolore eu fugiat nulla pariatur. Excepteur sint occaecat cupidatat non proident, sunt in culpa qui officia deserunt mollit anim id est laborum.</w:t>
+      </w:r>
+    </w:p>
+    <w:p>
+      <w:pPr>
+        <w:jc w:val="center"/>
+      </w:pPr>
+      <w:r>
+        <w:br w:type="page"/>
+      </w:r>
+    </w:p>
+    <w:p>
+      <w:pPr>
+        <w:jc w:val="center"/>
+        <w:rPr>
+          <w:sz w:val="28"/>
+          <w:szCs w:val="28"/>
+        </w:rPr>
+      </w:pPr>
+      <w:r>
+        <w:rPr>
+          <w:sz w:val="28"/>
+          <w:szCs w:val="28"/>
+        </w:rPr>
+        <w:lastRenderedPageBreak/>
+        <w:t>Screen Shots</w:t>
+      </w:r>
+    </w:p>
+    <w:p>
+      <w:pPr>
+        <w:jc w:val="center"/>
+        <w:rPr>
+          <w:sz w:val="28"/>
+          <w:szCs w:val="28"/>
+        </w:rPr>
+      </w:pPr>
+    </w:p>
+    <w:p>
+      <w:pPr>
+        <w:jc w:val="center"/>
+      </w:pPr>
+      <w:r>
+        <w:rPr>
+          <w:noProof/>
+        </w:rPr>
+        <w:drawing>
+          <wp:inline distT="114300" distB="114300" distL="114300" distR="114300" wp14:anchorId="77D189C9" wp14:editId="3C9FCE91">
+            <wp:extent cx="3148013" cy="1796373"/>
+            <wp:effectExtent l="0" t="0" r="0" b="0"/>
+            <wp:docPr id="1493560320" name="image1.jpg"/>
+            <wp:cNvGraphicFramePr/>
+            <a:graphic xmlns:a="http://schemas.openxmlformats.org/drawingml/2006/main">
+              <a:graphicData uri="http://schemas.openxmlformats.org/drawingml/2006/picture">
+                <pic:pic xmlns:pic="http://schemas.openxmlformats.org/drawingml/2006/picture">
+                  <pic:nvPicPr>
+                    <pic:cNvPr id="0" name="image1.jpg"/>
+                    <pic:cNvPicPr preferRelativeResize="0"/>
+                  </pic:nvPicPr>
+                  <pic:blipFill>
+                    <a:blip r:embed="rId5"/>
+                    <a:srcRect/>
+                    <a:stretch>
+                      <a:fillRect/>
+                    </a:stretch>
+                  </pic:blipFill>
+                  <pic:spPr>
+                    <a:xfrm>
+                      <a:off x="0" y="0"/>
+                      <a:ext cx="3148013" cy="1796373"/>
+                    </a:xfrm>
+                    <a:prstGeom prst="rect">
+                      <a:avLst/>
+                    </a:prstGeom>
+                    <a:ln/>
+                  </pic:spPr>
+                </pic:pic>
+              </a:graphicData>
+            </a:graphic>
+          </wp:inline>
+        </w:drawing>
+      </w:r>
+    </w:p>
+    <w:p>
+      <w:pPr>
+        <w:jc w:val="center"/>
+      </w:pPr>
+      <w:r>
+        <w:t xml:space="preserve">Figure X: Part </w:t>
+      </w:r>
+      <w:r>
+        <w:t>2</w:t>
+      </w:r>
+      <w:r>
+        <w:t xml:space="preserve"> App Running</w:t>
+      </w:r>
+    </w:p>
+    <w:p>
+      <w:pPr>
+        <w:jc w:val="center"/>
+      </w:pPr>
+    </w:p>
+    <w:p>
+      <w:pPr>
+        <w:rPr>
+          <w:lang w:val="en-US"/>
+        </w:rPr>
+      </w:pPr>
+      <w:r>
+        <w:rPr>
+          <w:lang w:val="en-US"/>
+        </w:rPr>
+        <w:t xml:space="preserve">Lorem ipsum dolor sit amet, consectetur adipiscing elit, sed do eiusmod tempor incididunt ut labore et dolore magna aliqua. </w:t>
+      </w:r>
+      <w:r>
+        <w:rPr>
+          <w:lang w:val="pt-BR"/>
+        </w:rPr>
+        <w:t xml:space="preserve">Ut enim ad minim veniam, quis nostrud exercitation ullamco laboris nisi ut aliquip ex ea commodo consequat. </w:t>
+      </w:r>
+      <w:r>
+        <w:rPr>
+          <w:lang w:val="en-US"/>
+        </w:rPr>
+        <w:t>Duis aute irure dolor in reprehenderit in voluptate velit esse cillum dolore eu fugiat nulla pariatur. Excepteur sint occaecat cupidatat non proident, sunt in culpa qui officia deserunt mollit anim id est laborum.</w:t>
+      </w:r>
+    </w:p>
+    <w:p/>
+    <w:p/>
+    <w:p>
+      <w:pPr>
+        <w:jc w:val="center"/>
+        <w:rPr>
+          <w:sz w:val="28"/>
+          <w:szCs w:val="28"/>
+        </w:rPr>
+      </w:pPr>
+    </w:p>
+    <w:p>
+      <w:pPr>
+        <w:jc w:val="center"/>
+      </w:pPr>
+      <w:r>
+        <w:rPr>
+          <w:noProof/>
+        </w:rPr>
+        <w:drawing>
+          <wp:inline distT="114300" distB="114300" distL="114300" distR="114300" wp14:anchorId="59C475E7" wp14:editId="60EC07F7">
+            <wp:extent cx="3148013" cy="1796373"/>
+            <wp:effectExtent l="0" t="0" r="0" b="0"/>
+            <wp:docPr id="1643367640" name="image1.jpg"/>
+            <wp:cNvGraphicFramePr/>
+            <a:graphic xmlns:a="http://schemas.openxmlformats.org/drawingml/2006/main">
+              <a:graphicData uri="http://schemas.openxmlformats.org/drawingml/2006/picture">
+                <pic:pic xmlns:pic="http://schemas.openxmlformats.org/drawingml/2006/picture">
+                  <pic:nvPicPr>
+                    <pic:cNvPr id="0" name="image1.jpg"/>
+                    <pic:cNvPicPr preferRelativeResize="0"/>
+                  </pic:nvPicPr>
+                  <pic:blipFill>
+                    <a:blip r:embed="rId5"/>
+                    <a:srcRect/>
+                    <a:stretch>
+                      <a:fillRect/>
+                    </a:stretch>
+                  </pic:blipFill>
+                  <pic:spPr>
+                    <a:xfrm>
+                      <a:off x="0" y="0"/>
+                      <a:ext cx="3148013" cy="1796373"/>
+                    </a:xfrm>
+                    <a:prstGeom prst="rect">
+                      <a:avLst/>
+                    </a:prstGeom>
+                    <a:ln/>
+                  </pic:spPr>
+                </pic:pic>
+              </a:graphicData>
+            </a:graphic>
+          </wp:inline>
+        </w:drawing>
+      </w:r>
+    </w:p>
+    <w:p>
+      <w:pPr>
+        <w:jc w:val="center"/>
+      </w:pPr>
+      <w:r>
+        <w:t>Figure X: Screenshot of successful output</w:t>
+      </w:r>
+    </w:p>
+    <w:p>
+      <w:pPr>
+        <w:jc w:val="center"/>
+      </w:pPr>
+    </w:p>
+    <w:p>
+      <w:r>
+        <w:rPr>
+          <w:lang w:val="en-US"/>
+        </w:rPr>
+        <w:t>Lorem ipsum dolor sit amet, consectetur adipiscing elit, sed do eiusmod tempor incididunt ut labore et dolore magna aliqua. Ut enim ad minim veniam, quis nostrud exercitation ullamco laboris nisi ut aliquip ex ea commodo consequat. Duis aute irure dolor in reprehenderit in voluptate velit esse cillum dolore eu fugiat nulla pariatur. Excepteur sint occaecat cupidatat non proident, sunt in culpa qui officia deserunt mollit anim id est laborum.</w:t>
+      </w:r>
+    </w:p>
+    <w:p/>
+    <w:p/>
+    <w:p>
+      <w:pPr>
+        <w:jc w:val="center"/>
+      </w:pPr>
+      <w:r>
+        <w:rPr>
+          <w:noProof/>
+        </w:rPr>
+        <w:lastRenderedPageBreak/>
+        <w:drawing>
+          <wp:inline distT="114300" distB="114300" distL="114300" distR="114300" wp14:anchorId="59FA81E5" wp14:editId="7A560EFF">
+            <wp:extent cx="3148013" cy="1796373"/>
+            <wp:effectExtent l="0" t="0" r="0" b="0"/>
+            <wp:docPr id="1004731626" name="image1.jpg"/>
+            <wp:cNvGraphicFramePr/>
+            <a:graphic xmlns:a="http://schemas.openxmlformats.org/drawingml/2006/main">
+              <a:graphicData uri="http://schemas.openxmlformats.org/drawingml/2006/picture">
+                <pic:pic xmlns:pic="http://schemas.openxmlformats.org/drawingml/2006/picture">
+                  <pic:nvPicPr>
+                    <pic:cNvPr id="0" name="image1.jpg"/>
+                    <pic:cNvPicPr preferRelativeResize="0"/>
+                  </pic:nvPicPr>
+                  <pic:blipFill>
+                    <a:blip r:embed="rId5"/>
+                    <a:srcRect/>
+                    <a:stretch>
+                      <a:fillRect/>
+                    </a:stretch>
+                  </pic:blipFill>
+                  <pic:spPr>
+                    <a:xfrm>
+                      <a:off x="0" y="0"/>
+                      <a:ext cx="3148013" cy="1796373"/>
+                    </a:xfrm>
+                    <a:prstGeom prst="rect">
+                      <a:avLst/>
+                    </a:prstGeom>
+                    <a:ln/>
+                  </pic:spPr>
+                </pic:pic>
+              </a:graphicData>
+            </a:graphic>
+          </wp:inline>
+        </w:drawing>
+      </w:r>
+    </w:p>
+    <w:p>
+      <w:pPr>
+        <w:jc w:val="center"/>
+      </w:pPr>
+      <w:r>
         <w:t>Figure X: Screenshot of Error Handling</w:t>
       </w:r>
     </w:p>
@@ -766,17 +1202,252 @@
     <w:p/>
     <w:p/>
     <w:p>
-      <w:pPr>
-        <w:jc w:val="center"/>
-        <w:rPr>
-          <w:sz w:val="28"/>
-          <w:szCs w:val="28"/>
-        </w:rPr>
-      </w:pPr>
       <w:r>
         <w:br w:type="page"/>
       </w:r>
     </w:p>
+    <w:p/>
+    <w:p>
+      <w:pPr>
+        <w:jc w:val="center"/>
+        <w:rPr>
+          <w:b/>
+          <w:sz w:val="28"/>
+          <w:szCs w:val="28"/>
+        </w:rPr>
+      </w:pPr>
+      <w:r>
+        <w:rPr>
+          <w:b/>
+          <w:sz w:val="28"/>
+          <w:szCs w:val="28"/>
+        </w:rPr>
+        <w:t xml:space="preserve">Part </w:t>
+      </w:r>
+      <w:r>
+        <w:rPr>
+          <w:b/>
+          <w:sz w:val="28"/>
+          <w:szCs w:val="28"/>
+        </w:rPr>
+        <w:t>3</w:t>
+      </w:r>
+    </w:p>
+    <w:p>
+      <w:pPr>
+        <w:rPr>
+          <w:lang w:val="en-US"/>
+        </w:rPr>
+      </w:pPr>
+    </w:p>
+    <w:p>
+      <w:pPr>
+        <w:jc w:val="center"/>
+        <w:rPr>
+          <w:sz w:val="28"/>
+          <w:szCs w:val="28"/>
+        </w:rPr>
+      </w:pPr>
+      <w:r>
+        <w:rPr>
+          <w:sz w:val="28"/>
+          <w:szCs w:val="28"/>
+        </w:rPr>
+        <w:t>FLOW CHART</w:t>
+      </w:r>
+    </w:p>
+    <w:p>
+      <w:pPr>
+        <w:jc w:val="center"/>
+        <w:rPr>
+          <w:sz w:val="28"/>
+          <w:szCs w:val="28"/>
+        </w:rPr>
+      </w:pPr>
+    </w:p>
+    <w:p>
+      <w:pPr>
+        <w:jc w:val="center"/>
+      </w:pPr>
+      <w:r>
+        <w:rPr>
+          <w:noProof/>
+        </w:rPr>
+        <w:drawing>
+          <wp:inline distT="114300" distB="114300" distL="114300" distR="114300" wp14:anchorId="5F451F99" wp14:editId="79DA2C96">
+            <wp:extent cx="3148013" cy="1796373"/>
+            <wp:effectExtent l="0" t="0" r="0" b="0"/>
+            <wp:docPr id="905574333" name="image1.jpg"/>
+            <wp:cNvGraphicFramePr/>
+            <a:graphic xmlns:a="http://schemas.openxmlformats.org/drawingml/2006/main">
+              <a:graphicData uri="http://schemas.openxmlformats.org/drawingml/2006/picture">
+                <pic:pic xmlns:pic="http://schemas.openxmlformats.org/drawingml/2006/picture">
+                  <pic:nvPicPr>
+                    <pic:cNvPr id="0" name="image1.jpg"/>
+                    <pic:cNvPicPr preferRelativeResize="0"/>
+                  </pic:nvPicPr>
+                  <pic:blipFill>
+                    <a:blip r:embed="rId5"/>
+                    <a:srcRect/>
+                    <a:stretch>
+                      <a:fillRect/>
+                    </a:stretch>
+                  </pic:blipFill>
+                  <pic:spPr>
+                    <a:xfrm>
+                      <a:off x="0" y="0"/>
+                      <a:ext cx="3148013" cy="1796373"/>
+                    </a:xfrm>
+                    <a:prstGeom prst="rect">
+                      <a:avLst/>
+                    </a:prstGeom>
+                    <a:ln/>
+                  </pic:spPr>
+                </pic:pic>
+              </a:graphicData>
+            </a:graphic>
+          </wp:inline>
+        </w:drawing>
+      </w:r>
+    </w:p>
+    <w:p>
+      <w:pPr>
+        <w:jc w:val="center"/>
+      </w:pPr>
+      <w:r>
+        <w:t>Figure X: Flow chart of XXXXXXX</w:t>
+      </w:r>
+    </w:p>
+    <w:p>
+      <w:pPr>
+        <w:jc w:val="center"/>
+      </w:pPr>
+    </w:p>
+    <w:p>
+      <w:r>
+        <w:rPr>
+          <w:lang w:val="en-US"/>
+        </w:rPr>
+        <w:t>"Lorem ipsum dolor sit amet, consectetur adipiscing elit, sed do eiusmod tempor incididunt ut labore et dolore magna aliqua. Ut enim ad minim veniam, quis nostrud exercitation ullamco laboris nisi ut aliquip ex ea commodo consequat. Duis aute irure dolor in reprehenderit in voluptate velit esse cillum dolore eu fugiat nulla pariatur. Excepteur sint occaecat cupidatat non proident, sunt in culpa qui officia deserunt mollit anim id est laborum."</w:t>
+      </w:r>
+    </w:p>
+    <w:p>
+      <w:r>
+        <w:br w:type="page"/>
+      </w:r>
+    </w:p>
+    <w:p/>
+    <w:p>
+      <w:pPr>
+        <w:jc w:val="center"/>
+        <w:rPr>
+          <w:sz w:val="28"/>
+          <w:szCs w:val="28"/>
+        </w:rPr>
+      </w:pPr>
+      <w:r>
+        <w:rPr>
+          <w:sz w:val="28"/>
+          <w:szCs w:val="28"/>
+        </w:rPr>
+        <w:t>UML Class Diagram</w:t>
+      </w:r>
+    </w:p>
+    <w:p>
+      <w:pPr>
+        <w:jc w:val="center"/>
+        <w:rPr>
+          <w:sz w:val="28"/>
+          <w:szCs w:val="28"/>
+        </w:rPr>
+      </w:pPr>
+    </w:p>
+    <w:p>
+      <w:pPr>
+        <w:jc w:val="center"/>
+      </w:pPr>
+      <w:r>
+        <w:rPr>
+          <w:noProof/>
+        </w:rPr>
+        <w:drawing>
+          <wp:inline distT="114300" distB="114300" distL="114300" distR="114300" wp14:anchorId="41ED67EF" wp14:editId="4BB915F6">
+            <wp:extent cx="3148013" cy="1796373"/>
+            <wp:effectExtent l="0" t="0" r="0" b="0"/>
+            <wp:docPr id="1955513105" name="image1.jpg"/>
+            <wp:cNvGraphicFramePr/>
+            <a:graphic xmlns:a="http://schemas.openxmlformats.org/drawingml/2006/main">
+              <a:graphicData uri="http://schemas.openxmlformats.org/drawingml/2006/picture">
+                <pic:pic xmlns:pic="http://schemas.openxmlformats.org/drawingml/2006/picture">
+                  <pic:nvPicPr>
+                    <pic:cNvPr id="0" name="image1.jpg"/>
+                    <pic:cNvPicPr preferRelativeResize="0"/>
+                  </pic:nvPicPr>
+                  <pic:blipFill>
+                    <a:blip r:embed="rId5"/>
+                    <a:srcRect/>
+                    <a:stretch>
+                      <a:fillRect/>
+                    </a:stretch>
+                  </pic:blipFill>
+                  <pic:spPr>
+                    <a:xfrm>
+                      <a:off x="0" y="0"/>
+                      <a:ext cx="3148013" cy="1796373"/>
+                    </a:xfrm>
+                    <a:prstGeom prst="rect">
+                      <a:avLst/>
+                    </a:prstGeom>
+                    <a:ln/>
+                  </pic:spPr>
+                </pic:pic>
+              </a:graphicData>
+            </a:graphic>
+          </wp:inline>
+        </w:drawing>
+      </w:r>
+    </w:p>
+    <w:p>
+      <w:pPr>
+        <w:jc w:val="center"/>
+      </w:pPr>
+      <w:r>
+        <w:t>Figure X: UML Class Diagram</w:t>
+      </w:r>
+    </w:p>
+    <w:p>
+      <w:pPr>
+        <w:jc w:val="center"/>
+      </w:pPr>
+    </w:p>
+    <w:p>
+      <w:r>
+        <w:rPr>
+          <w:lang w:val="en-US"/>
+        </w:rPr>
+        <w:t xml:space="preserve">Lorem ipsum dolor sit amet, consectetur adipiscing elit, sed do eiusmod tempor incididunt ut labore et dolore magna aliqua. </w:t>
+      </w:r>
+      <w:r>
+        <w:rPr>
+          <w:lang w:val="pt-BR"/>
+        </w:rPr>
+        <w:t xml:space="preserve">Ut enim ad minim veniam, quis nostrud exercitation ullamco laboris nisi ut aliquip ex ea commodo consequat. </w:t>
+      </w:r>
+      <w:r>
+        <w:rPr>
+          <w:lang w:val="en-US"/>
+        </w:rPr>
+        <w:t>Duis aute irure dolor in reprehenderit in voluptate velit esse cillum dolore eu fugiat nulla pariatur. Excepteur sint occaecat cupidatat non proident, sunt in culpa qui officia deserunt mollit anim id est laborum.</w:t>
+      </w:r>
+    </w:p>
+    <w:p>
+      <w:pPr>
+        <w:jc w:val="center"/>
+      </w:pPr>
+      <w:r>
+        <w:br w:type="page"/>
+      </w:r>
+    </w:p>
     <w:p>
       <w:pPr>
         <w:jc w:val="center"/>
@@ -791,92 +1462,763 @@
           <w:szCs w:val="28"/>
         </w:rPr>
         <w:lastRenderedPageBreak/>
-        <w:t>ADD ON</w:t>
-      </w:r>
-    </w:p>
-    <w:p/>
-    <w:p/>
-    <w:p/>
-    <w:p>
-      <w:pPr>
+        <w:t>Screen Shots</w:t>
+      </w:r>
+    </w:p>
+    <w:p>
+      <w:pPr>
+        <w:jc w:val="center"/>
+        <w:rPr>
+          <w:sz w:val="28"/>
+          <w:szCs w:val="28"/>
+        </w:rPr>
+      </w:pPr>
+    </w:p>
+    <w:p>
+      <w:pPr>
+        <w:jc w:val="center"/>
+      </w:pPr>
+      <w:r>
+        <w:rPr>
+          <w:noProof/>
+        </w:rPr>
+        <w:drawing>
+          <wp:inline distT="114300" distB="114300" distL="114300" distR="114300" wp14:anchorId="168C6BEA" wp14:editId="2414B8EA">
+            <wp:extent cx="3148013" cy="1796373"/>
+            <wp:effectExtent l="0" t="0" r="0" b="0"/>
+            <wp:docPr id="1132534699" name="image1.jpg"/>
+            <wp:cNvGraphicFramePr/>
+            <a:graphic xmlns:a="http://schemas.openxmlformats.org/drawingml/2006/main">
+              <a:graphicData uri="http://schemas.openxmlformats.org/drawingml/2006/picture">
+                <pic:pic xmlns:pic="http://schemas.openxmlformats.org/drawingml/2006/picture">
+                  <pic:nvPicPr>
+                    <pic:cNvPr id="0" name="image1.jpg"/>
+                    <pic:cNvPicPr preferRelativeResize="0"/>
+                  </pic:nvPicPr>
+                  <pic:blipFill>
+                    <a:blip r:embed="rId5"/>
+                    <a:srcRect/>
+                    <a:stretch>
+                      <a:fillRect/>
+                    </a:stretch>
+                  </pic:blipFill>
+                  <pic:spPr>
+                    <a:xfrm>
+                      <a:off x="0" y="0"/>
+                      <a:ext cx="3148013" cy="1796373"/>
+                    </a:xfrm>
+                    <a:prstGeom prst="rect">
+                      <a:avLst/>
+                    </a:prstGeom>
+                    <a:ln/>
+                  </pic:spPr>
+                </pic:pic>
+              </a:graphicData>
+            </a:graphic>
+          </wp:inline>
+        </w:drawing>
+      </w:r>
+    </w:p>
+    <w:p>
+      <w:pPr>
+        <w:jc w:val="center"/>
+      </w:pPr>
+      <w:r>
+        <w:t xml:space="preserve">Figure X: Part </w:t>
+      </w:r>
+      <w:r>
+        <w:t>3</w:t>
+      </w:r>
+      <w:r>
+        <w:t xml:space="preserve"> App Running</w:t>
+      </w:r>
+    </w:p>
+    <w:p>
+      <w:pPr>
+        <w:jc w:val="center"/>
+      </w:pPr>
+    </w:p>
+    <w:p>
+      <w:pPr>
+        <w:rPr>
+          <w:lang w:val="en-US"/>
+        </w:rPr>
+      </w:pPr>
+      <w:r>
+        <w:rPr>
+          <w:lang w:val="en-US"/>
+        </w:rPr>
+        <w:t xml:space="preserve">Lorem ipsum dolor sit amet, consectetur adipiscing elit, sed do eiusmod tempor incididunt ut labore et dolore magna aliqua. </w:t>
+      </w:r>
+      <w:r>
+        <w:rPr>
+          <w:lang w:val="pt-BR"/>
+        </w:rPr>
+        <w:t xml:space="preserve">Ut enim ad minim veniam, quis nostrud exercitation ullamco laboris nisi ut aliquip ex ea commodo consequat. </w:t>
+      </w:r>
+      <w:r>
+        <w:rPr>
+          <w:lang w:val="en-US"/>
+        </w:rPr>
+        <w:t>Duis aute irure dolor in reprehenderit in voluptate velit esse cillum dolore eu fugiat nulla pariatur. Excepteur sint occaecat cupidatat non proident, sunt in culpa qui officia deserunt mollit anim id est laborum.</w:t>
+      </w:r>
+    </w:p>
+    <w:p/>
+    <w:p/>
+    <w:p>
+      <w:pPr>
+        <w:jc w:val="center"/>
+        <w:rPr>
+          <w:sz w:val="28"/>
+          <w:szCs w:val="28"/>
+        </w:rPr>
+      </w:pPr>
+    </w:p>
+    <w:p>
+      <w:pPr>
+        <w:jc w:val="center"/>
+      </w:pPr>
+      <w:r>
+        <w:rPr>
+          <w:noProof/>
+        </w:rPr>
+        <w:drawing>
+          <wp:inline distT="114300" distB="114300" distL="114300" distR="114300" wp14:anchorId="4A06B8BB" wp14:editId="7EE9C1F6">
+            <wp:extent cx="3148013" cy="1796373"/>
+            <wp:effectExtent l="0" t="0" r="0" b="0"/>
+            <wp:docPr id="1684668719" name="image1.jpg"/>
+            <wp:cNvGraphicFramePr/>
+            <a:graphic xmlns:a="http://schemas.openxmlformats.org/drawingml/2006/main">
+              <a:graphicData uri="http://schemas.openxmlformats.org/drawingml/2006/picture">
+                <pic:pic xmlns:pic="http://schemas.openxmlformats.org/drawingml/2006/picture">
+                  <pic:nvPicPr>
+                    <pic:cNvPr id="0" name="image1.jpg"/>
+                    <pic:cNvPicPr preferRelativeResize="0"/>
+                  </pic:nvPicPr>
+                  <pic:blipFill>
+                    <a:blip r:embed="rId5"/>
+                    <a:srcRect/>
+                    <a:stretch>
+                      <a:fillRect/>
+                    </a:stretch>
+                  </pic:blipFill>
+                  <pic:spPr>
+                    <a:xfrm>
+                      <a:off x="0" y="0"/>
+                      <a:ext cx="3148013" cy="1796373"/>
+                    </a:xfrm>
+                    <a:prstGeom prst="rect">
+                      <a:avLst/>
+                    </a:prstGeom>
+                    <a:ln/>
+                  </pic:spPr>
+                </pic:pic>
+              </a:graphicData>
+            </a:graphic>
+          </wp:inline>
+        </w:drawing>
+      </w:r>
+    </w:p>
+    <w:p>
+      <w:pPr>
+        <w:jc w:val="center"/>
+      </w:pPr>
+      <w:r>
+        <w:t>Figure X: Screenshot of successful output</w:t>
+      </w:r>
+    </w:p>
+    <w:p>
+      <w:pPr>
+        <w:jc w:val="center"/>
+      </w:pPr>
+    </w:p>
+    <w:p>
+      <w:r>
+        <w:rPr>
+          <w:lang w:val="en-US"/>
+        </w:rPr>
+        <w:t>Lorem ipsum dolor sit amet, consectetur adipiscing elit, sed do eiusmod tempor incididunt ut labore et dolore magna aliqua. Ut enim ad minim veniam, quis nostrud exercitation ullamco laboris nisi ut aliquip ex ea commodo consequat. Duis aute irure dolor in reprehenderit in voluptate velit esse cillum dolore eu fugiat nulla pariatur. Excepteur sint occaecat cupidatat non proident, sunt in culpa qui officia deserunt mollit anim id est laborum.</w:t>
+      </w:r>
+    </w:p>
+    <w:p/>
+    <w:p/>
+    <w:p>
+      <w:pPr>
+        <w:jc w:val="center"/>
+      </w:pPr>
+      <w:r>
+        <w:rPr>
+          <w:noProof/>
+        </w:rPr>
+        <w:lastRenderedPageBreak/>
+        <w:drawing>
+          <wp:inline distT="114300" distB="114300" distL="114300" distR="114300" wp14:anchorId="68C2E703" wp14:editId="1825469E">
+            <wp:extent cx="3148013" cy="1796373"/>
+            <wp:effectExtent l="0" t="0" r="0" b="0"/>
+            <wp:docPr id="1536500323" name="image1.jpg"/>
+            <wp:cNvGraphicFramePr/>
+            <a:graphic xmlns:a="http://schemas.openxmlformats.org/drawingml/2006/main">
+              <a:graphicData uri="http://schemas.openxmlformats.org/drawingml/2006/picture">
+                <pic:pic xmlns:pic="http://schemas.openxmlformats.org/drawingml/2006/picture">
+                  <pic:nvPicPr>
+                    <pic:cNvPr id="0" name="image1.jpg"/>
+                    <pic:cNvPicPr preferRelativeResize="0"/>
+                  </pic:nvPicPr>
+                  <pic:blipFill>
+                    <a:blip r:embed="rId5"/>
+                    <a:srcRect/>
+                    <a:stretch>
+                      <a:fillRect/>
+                    </a:stretch>
+                  </pic:blipFill>
+                  <pic:spPr>
+                    <a:xfrm>
+                      <a:off x="0" y="0"/>
+                      <a:ext cx="3148013" cy="1796373"/>
+                    </a:xfrm>
+                    <a:prstGeom prst="rect">
+                      <a:avLst/>
+                    </a:prstGeom>
+                    <a:ln/>
+                  </pic:spPr>
+                </pic:pic>
+              </a:graphicData>
+            </a:graphic>
+          </wp:inline>
+        </w:drawing>
+      </w:r>
+    </w:p>
+    <w:p>
+      <w:pPr>
+        <w:jc w:val="center"/>
+      </w:pPr>
+      <w:r>
+        <w:t>Figure X: Screenshot of Error Handling</w:t>
+      </w:r>
+    </w:p>
+    <w:p>
+      <w:pPr>
+        <w:jc w:val="center"/>
+      </w:pPr>
+    </w:p>
+    <w:p>
+      <w:r>
+        <w:rPr>
+          <w:lang w:val="en-US"/>
+        </w:rPr>
+        <w:t>Lorem ipsum dolor sit amet, consectetur adipiscing elit, sed do eiusmod tempor incididunt ut labore et dolore magna aliqua. Ut enim ad minim veniam, quis nostrud exercitation ullamco laboris nisi ut aliquip ex ea commodo consequat. Duis aute irure dolor in reprehenderit in voluptate velit esse cillum dolore eu fugiat nulla pariatur. Excepteur sint occaecat cupidatat non proident, sunt in culpa qui officia deserunt mollit anim id est laborum.</w:t>
+      </w:r>
+    </w:p>
+    <w:p/>
+    <w:p/>
+    <w:p>
+      <w:r>
+        <w:br w:type="page"/>
+      </w:r>
+    </w:p>
+    <w:p/>
+    <w:p>
+      <w:pPr>
+        <w:jc w:val="center"/>
         <w:rPr>
           <w:b/>
+          <w:sz w:val="28"/>
+          <w:szCs w:val="28"/>
         </w:rPr>
       </w:pPr>
       <w:r>
         <w:rPr>
           <w:b/>
-        </w:rPr>
-        <w:t>Follow up Questions</w:t>
-      </w:r>
-    </w:p>
-    <w:p>
-      <w:pPr>
-        <w:numPr>
-          <w:ilvl w:val="0"/>
-          <w:numId w:val="1"/>
-        </w:numPr>
-        <w:shd w:val="clear" w:color="auto" w:fill="FFFFFF" w:themeFill="background1"/>
-      </w:pPr>
-      <w:r>
-        <w:rPr>
-          <w:rFonts w:ascii="Open Sans" w:eastAsia="Open Sans" w:hAnsi="Open Sans" w:cs="Open Sans"/>
-          <w:color w:val="616161"/>
-          <w:lang w:val="en-US"/>
-        </w:rPr>
-        <w:t>What was challenging?</w:t>
-      </w:r>
-    </w:p>
-    <w:p>
-      <w:pPr>
-        <w:numPr>
-          <w:ilvl w:val="0"/>
-          <w:numId w:val="1"/>
-        </w:numPr>
-        <w:shd w:val="clear" w:color="auto" w:fill="FFFFFF"/>
-      </w:pPr>
-      <w:r>
-        <w:rPr>
-          <w:rFonts w:ascii="Open Sans" w:eastAsia="Open Sans" w:hAnsi="Open Sans" w:cs="Open Sans"/>
-          <w:color w:val="616161"/>
-        </w:rPr>
-        <w:t>What did you learn?</w:t>
-      </w:r>
-    </w:p>
-    <w:p>
-      <w:pPr>
-        <w:numPr>
-          <w:ilvl w:val="0"/>
-          <w:numId w:val="1"/>
-        </w:numPr>
-        <w:shd w:val="clear" w:color="auto" w:fill="FFFFFF"/>
-      </w:pPr>
-      <w:r>
-        <w:rPr>
-          <w:rFonts w:ascii="Open Sans" w:eastAsia="Open Sans" w:hAnsi="Open Sans" w:cs="Open Sans"/>
-          <w:color w:val="616161"/>
-        </w:rPr>
-        <w:t>How would you improve on the project?</w:t>
-      </w:r>
-    </w:p>
-    <w:p>
-      <w:pPr>
-        <w:numPr>
-          <w:ilvl w:val="0"/>
-          <w:numId w:val="1"/>
-        </w:numPr>
-        <w:shd w:val="clear" w:color="auto" w:fill="FFFFFF"/>
-        <w:spacing w:after="120"/>
-      </w:pPr>
-      <w:r>
-        <w:rPr>
-          <w:rFonts w:ascii="Open Sans" w:eastAsia="Open Sans" w:hAnsi="Open Sans" w:cs="Open Sans"/>
-          <w:color w:val="616161"/>
-        </w:rPr>
-        <w:t>How can you use what you learned on the job?</w:t>
-      </w:r>
-    </w:p>
-    <w:p/>
+          <w:sz w:val="28"/>
+          <w:szCs w:val="28"/>
+        </w:rPr>
+        <w:t xml:space="preserve">Part </w:t>
+      </w:r>
+      <w:r>
+        <w:rPr>
+          <w:b/>
+          <w:sz w:val="28"/>
+          <w:szCs w:val="28"/>
+        </w:rPr>
+        <w:t>4</w:t>
+      </w:r>
+    </w:p>
+    <w:p>
+      <w:pPr>
+        <w:rPr>
+          <w:lang w:val="en-US"/>
+        </w:rPr>
+      </w:pPr>
+    </w:p>
+    <w:p>
+      <w:pPr>
+        <w:jc w:val="center"/>
+        <w:rPr>
+          <w:sz w:val="28"/>
+          <w:szCs w:val="28"/>
+        </w:rPr>
+      </w:pPr>
+      <w:r>
+        <w:rPr>
+          <w:sz w:val="28"/>
+          <w:szCs w:val="28"/>
+        </w:rPr>
+        <w:t>FLOW CHART</w:t>
+      </w:r>
+    </w:p>
+    <w:p>
+      <w:pPr>
+        <w:jc w:val="center"/>
+        <w:rPr>
+          <w:sz w:val="28"/>
+          <w:szCs w:val="28"/>
+        </w:rPr>
+      </w:pPr>
+    </w:p>
+    <w:p>
+      <w:pPr>
+        <w:jc w:val="center"/>
+      </w:pPr>
+      <w:r>
+        <w:rPr>
+          <w:noProof/>
+        </w:rPr>
+        <w:drawing>
+          <wp:inline distT="114300" distB="114300" distL="114300" distR="114300" wp14:anchorId="2A48C347" wp14:editId="447843FF">
+            <wp:extent cx="3148013" cy="1796373"/>
+            <wp:effectExtent l="0" t="0" r="0" b="0"/>
+            <wp:docPr id="760675676" name="image1.jpg"/>
+            <wp:cNvGraphicFramePr/>
+            <a:graphic xmlns:a="http://schemas.openxmlformats.org/drawingml/2006/main">
+              <a:graphicData uri="http://schemas.openxmlformats.org/drawingml/2006/picture">
+                <pic:pic xmlns:pic="http://schemas.openxmlformats.org/drawingml/2006/picture">
+                  <pic:nvPicPr>
+                    <pic:cNvPr id="0" name="image1.jpg"/>
+                    <pic:cNvPicPr preferRelativeResize="0"/>
+                  </pic:nvPicPr>
+                  <pic:blipFill>
+                    <a:blip r:embed="rId5"/>
+                    <a:srcRect/>
+                    <a:stretch>
+                      <a:fillRect/>
+                    </a:stretch>
+                  </pic:blipFill>
+                  <pic:spPr>
+                    <a:xfrm>
+                      <a:off x="0" y="0"/>
+                      <a:ext cx="3148013" cy="1796373"/>
+                    </a:xfrm>
+                    <a:prstGeom prst="rect">
+                      <a:avLst/>
+                    </a:prstGeom>
+                    <a:ln/>
+                  </pic:spPr>
+                </pic:pic>
+              </a:graphicData>
+            </a:graphic>
+          </wp:inline>
+        </w:drawing>
+      </w:r>
+    </w:p>
+    <w:p>
+      <w:pPr>
+        <w:jc w:val="center"/>
+      </w:pPr>
+      <w:r>
+        <w:t>Figure X: Flow chart of XXXXXXX</w:t>
+      </w:r>
+    </w:p>
+    <w:p>
+      <w:pPr>
+        <w:jc w:val="center"/>
+      </w:pPr>
+    </w:p>
+    <w:p>
+      <w:r>
+        <w:rPr>
+          <w:lang w:val="en-US"/>
+        </w:rPr>
+        <w:t>"Lorem ipsum dolor sit amet, consectetur adipiscing elit, sed do eiusmod tempor incididunt ut labore et dolore magna aliqua. Ut enim ad minim veniam, quis nostrud exercitation ullamco laboris nisi ut aliquip ex ea commodo consequat. Duis aute irure dolor in reprehenderit in voluptate velit esse cillum dolore eu fugiat nulla pariatur. Excepteur sint occaecat cupidatat non proident, sunt in culpa qui officia deserunt mollit anim id est laborum."</w:t>
+      </w:r>
+    </w:p>
+    <w:p>
+      <w:r>
+        <w:br w:type="page"/>
+      </w:r>
+    </w:p>
+    <w:p/>
+    <w:p>
+      <w:pPr>
+        <w:jc w:val="center"/>
+        <w:rPr>
+          <w:sz w:val="28"/>
+          <w:szCs w:val="28"/>
+        </w:rPr>
+      </w:pPr>
+      <w:r>
+        <w:rPr>
+          <w:sz w:val="28"/>
+          <w:szCs w:val="28"/>
+        </w:rPr>
+        <w:t>UML Class Diagram</w:t>
+      </w:r>
+    </w:p>
+    <w:p>
+      <w:pPr>
+        <w:jc w:val="center"/>
+        <w:rPr>
+          <w:sz w:val="28"/>
+          <w:szCs w:val="28"/>
+        </w:rPr>
+      </w:pPr>
+    </w:p>
+    <w:p>
+      <w:pPr>
+        <w:jc w:val="center"/>
+      </w:pPr>
+      <w:r>
+        <w:rPr>
+          <w:noProof/>
+        </w:rPr>
+        <w:drawing>
+          <wp:inline distT="114300" distB="114300" distL="114300" distR="114300" wp14:anchorId="54D5793C" wp14:editId="1C98C658">
+            <wp:extent cx="3148013" cy="1796373"/>
+            <wp:effectExtent l="0" t="0" r="0" b="0"/>
+            <wp:docPr id="1436352972" name="image1.jpg"/>
+            <wp:cNvGraphicFramePr/>
+            <a:graphic xmlns:a="http://schemas.openxmlformats.org/drawingml/2006/main">
+              <a:graphicData uri="http://schemas.openxmlformats.org/drawingml/2006/picture">
+                <pic:pic xmlns:pic="http://schemas.openxmlformats.org/drawingml/2006/picture">
+                  <pic:nvPicPr>
+                    <pic:cNvPr id="0" name="image1.jpg"/>
+                    <pic:cNvPicPr preferRelativeResize="0"/>
+                  </pic:nvPicPr>
+                  <pic:blipFill>
+                    <a:blip r:embed="rId5"/>
+                    <a:srcRect/>
+                    <a:stretch>
+                      <a:fillRect/>
+                    </a:stretch>
+                  </pic:blipFill>
+                  <pic:spPr>
+                    <a:xfrm>
+                      <a:off x="0" y="0"/>
+                      <a:ext cx="3148013" cy="1796373"/>
+                    </a:xfrm>
+                    <a:prstGeom prst="rect">
+                      <a:avLst/>
+                    </a:prstGeom>
+                    <a:ln/>
+                  </pic:spPr>
+                </pic:pic>
+              </a:graphicData>
+            </a:graphic>
+          </wp:inline>
+        </w:drawing>
+      </w:r>
+    </w:p>
+    <w:p>
+      <w:pPr>
+        <w:jc w:val="center"/>
+      </w:pPr>
+      <w:r>
+        <w:t>Figure X: UML Class Diagram</w:t>
+      </w:r>
+    </w:p>
+    <w:p>
+      <w:pPr>
+        <w:jc w:val="center"/>
+      </w:pPr>
+    </w:p>
+    <w:p>
+      <w:r>
+        <w:rPr>
+          <w:lang w:val="en-US"/>
+        </w:rPr>
+        <w:t xml:space="preserve">Lorem ipsum dolor sit amet, consectetur adipiscing elit, sed do eiusmod tempor incididunt ut labore et dolore magna aliqua. </w:t>
+      </w:r>
+      <w:r>
+        <w:rPr>
+          <w:lang w:val="pt-BR"/>
+        </w:rPr>
+        <w:t xml:space="preserve">Ut enim ad minim veniam, quis nostrud exercitation ullamco laboris nisi ut aliquip ex ea commodo consequat. </w:t>
+      </w:r>
+      <w:r>
+        <w:rPr>
+          <w:lang w:val="en-US"/>
+        </w:rPr>
+        <w:t>Duis aute irure dolor in reprehenderit in voluptate velit esse cillum dolore eu fugiat nulla pariatur. Excepteur sint occaecat cupidatat non proident, sunt in culpa qui officia deserunt mollit anim id est laborum.</w:t>
+      </w:r>
+    </w:p>
+    <w:p>
+      <w:pPr>
+        <w:jc w:val="center"/>
+      </w:pPr>
+      <w:r>
+        <w:br w:type="page"/>
+      </w:r>
+    </w:p>
+    <w:p>
+      <w:pPr>
+        <w:jc w:val="center"/>
+        <w:rPr>
+          <w:sz w:val="28"/>
+          <w:szCs w:val="28"/>
+        </w:rPr>
+      </w:pPr>
+      <w:r>
+        <w:rPr>
+          <w:sz w:val="28"/>
+          <w:szCs w:val="28"/>
+        </w:rPr>
+        <w:lastRenderedPageBreak/>
+        <w:t>Screen Shots</w:t>
+      </w:r>
+    </w:p>
+    <w:p>
+      <w:pPr>
+        <w:jc w:val="center"/>
+        <w:rPr>
+          <w:sz w:val="28"/>
+          <w:szCs w:val="28"/>
+        </w:rPr>
+      </w:pPr>
+    </w:p>
+    <w:p>
+      <w:pPr>
+        <w:jc w:val="center"/>
+      </w:pPr>
+      <w:r>
+        <w:rPr>
+          <w:noProof/>
+        </w:rPr>
+        <w:drawing>
+          <wp:inline distT="114300" distB="114300" distL="114300" distR="114300" wp14:anchorId="2BFDE5C0" wp14:editId="4663D10A">
+            <wp:extent cx="3148013" cy="1796373"/>
+            <wp:effectExtent l="0" t="0" r="0" b="0"/>
+            <wp:docPr id="1597765753" name="image1.jpg"/>
+            <wp:cNvGraphicFramePr/>
+            <a:graphic xmlns:a="http://schemas.openxmlformats.org/drawingml/2006/main">
+              <a:graphicData uri="http://schemas.openxmlformats.org/drawingml/2006/picture">
+                <pic:pic xmlns:pic="http://schemas.openxmlformats.org/drawingml/2006/picture">
+                  <pic:nvPicPr>
+                    <pic:cNvPr id="0" name="image1.jpg"/>
+                    <pic:cNvPicPr preferRelativeResize="0"/>
+                  </pic:nvPicPr>
+                  <pic:blipFill>
+                    <a:blip r:embed="rId5"/>
+                    <a:srcRect/>
+                    <a:stretch>
+                      <a:fillRect/>
+                    </a:stretch>
+                  </pic:blipFill>
+                  <pic:spPr>
+                    <a:xfrm>
+                      <a:off x="0" y="0"/>
+                      <a:ext cx="3148013" cy="1796373"/>
+                    </a:xfrm>
+                    <a:prstGeom prst="rect">
+                      <a:avLst/>
+                    </a:prstGeom>
+                    <a:ln/>
+                  </pic:spPr>
+                </pic:pic>
+              </a:graphicData>
+            </a:graphic>
+          </wp:inline>
+        </w:drawing>
+      </w:r>
+    </w:p>
+    <w:p>
+      <w:pPr>
+        <w:jc w:val="center"/>
+      </w:pPr>
+      <w:r>
+        <w:t xml:space="preserve">Figure X: Part </w:t>
+      </w:r>
+      <w:r>
+        <w:t>4</w:t>
+      </w:r>
+      <w:r>
+        <w:t xml:space="preserve"> App Running</w:t>
+      </w:r>
+    </w:p>
+    <w:p>
+      <w:pPr>
+        <w:jc w:val="center"/>
+      </w:pPr>
+    </w:p>
+    <w:p>
+      <w:pPr>
+        <w:rPr>
+          <w:lang w:val="en-US"/>
+        </w:rPr>
+      </w:pPr>
+      <w:r>
+        <w:rPr>
+          <w:lang w:val="en-US"/>
+        </w:rPr>
+        <w:t xml:space="preserve">Lorem ipsum dolor sit amet, consectetur adipiscing elit, sed do eiusmod tempor incididunt ut labore et dolore magna aliqua. </w:t>
+      </w:r>
+      <w:r>
+        <w:rPr>
+          <w:lang w:val="pt-BR"/>
+        </w:rPr>
+        <w:t xml:space="preserve">Ut enim ad minim veniam, quis nostrud exercitation ullamco laboris nisi ut aliquip ex ea commodo consequat. </w:t>
+      </w:r>
+      <w:r>
+        <w:rPr>
+          <w:lang w:val="en-US"/>
+        </w:rPr>
+        <w:t>Duis aute irure dolor in reprehenderit in voluptate velit esse cillum dolore eu fugiat nulla pariatur. Excepteur sint occaecat cupidatat non proident, sunt in culpa qui officia deserunt mollit anim id est laborum.</w:t>
+      </w:r>
+    </w:p>
+    <w:p/>
+    <w:p/>
+    <w:p>
+      <w:pPr>
+        <w:jc w:val="center"/>
+        <w:rPr>
+          <w:sz w:val="28"/>
+          <w:szCs w:val="28"/>
+        </w:rPr>
+      </w:pPr>
+    </w:p>
+    <w:p>
+      <w:pPr>
+        <w:jc w:val="center"/>
+      </w:pPr>
+      <w:r>
+        <w:rPr>
+          <w:noProof/>
+        </w:rPr>
+        <w:drawing>
+          <wp:inline distT="114300" distB="114300" distL="114300" distR="114300" wp14:anchorId="7E5741BF" wp14:editId="748249C6">
+            <wp:extent cx="3148013" cy="1796373"/>
+            <wp:effectExtent l="0" t="0" r="0" b="0"/>
+            <wp:docPr id="458816738" name="image1.jpg"/>
+            <wp:cNvGraphicFramePr/>
+            <a:graphic xmlns:a="http://schemas.openxmlformats.org/drawingml/2006/main">
+              <a:graphicData uri="http://schemas.openxmlformats.org/drawingml/2006/picture">
+                <pic:pic xmlns:pic="http://schemas.openxmlformats.org/drawingml/2006/picture">
+                  <pic:nvPicPr>
+                    <pic:cNvPr id="0" name="image1.jpg"/>
+                    <pic:cNvPicPr preferRelativeResize="0"/>
+                  </pic:nvPicPr>
+                  <pic:blipFill>
+                    <a:blip r:embed="rId5"/>
+                    <a:srcRect/>
+                    <a:stretch>
+                      <a:fillRect/>
+                    </a:stretch>
+                  </pic:blipFill>
+                  <pic:spPr>
+                    <a:xfrm>
+                      <a:off x="0" y="0"/>
+                      <a:ext cx="3148013" cy="1796373"/>
+                    </a:xfrm>
+                    <a:prstGeom prst="rect">
+                      <a:avLst/>
+                    </a:prstGeom>
+                    <a:ln/>
+                  </pic:spPr>
+                </pic:pic>
+              </a:graphicData>
+            </a:graphic>
+          </wp:inline>
+        </w:drawing>
+      </w:r>
+    </w:p>
+    <w:p>
+      <w:pPr>
+        <w:jc w:val="center"/>
+      </w:pPr>
+      <w:r>
+        <w:t>Figure X: Screenshot of successful output</w:t>
+      </w:r>
+    </w:p>
+    <w:p>
+      <w:pPr>
+        <w:jc w:val="center"/>
+      </w:pPr>
+    </w:p>
+    <w:p>
+      <w:r>
+        <w:rPr>
+          <w:lang w:val="en-US"/>
+        </w:rPr>
+        <w:t>Lorem ipsum dolor sit amet, consectetur adipiscing elit, sed do eiusmod tempor incididunt ut labore et dolore magna aliqua. Ut enim ad minim veniam, quis nostrud exercitation ullamco laboris nisi ut aliquip ex ea commodo consequat. Duis aute irure dolor in reprehenderit in voluptate velit esse cillum dolore eu fugiat nulla pariatur. Excepteur sint occaecat cupidatat non proident, sunt in culpa qui officia deserunt mollit anim id est laborum.</w:t>
+      </w:r>
+    </w:p>
+    <w:p/>
+    <w:p/>
+    <w:p>
+      <w:pPr>
+        <w:jc w:val="center"/>
+      </w:pPr>
+      <w:r>
+        <w:rPr>
+          <w:noProof/>
+        </w:rPr>
+        <w:lastRenderedPageBreak/>
+        <w:drawing>
+          <wp:inline distT="114300" distB="114300" distL="114300" distR="114300" wp14:anchorId="455527D7" wp14:editId="6EE64722">
+            <wp:extent cx="3148013" cy="1796373"/>
+            <wp:effectExtent l="0" t="0" r="0" b="0"/>
+            <wp:docPr id="727658154" name="image1.jpg"/>
+            <wp:cNvGraphicFramePr/>
+            <a:graphic xmlns:a="http://schemas.openxmlformats.org/drawingml/2006/main">
+              <a:graphicData uri="http://schemas.openxmlformats.org/drawingml/2006/picture">
+                <pic:pic xmlns:pic="http://schemas.openxmlformats.org/drawingml/2006/picture">
+                  <pic:nvPicPr>
+                    <pic:cNvPr id="0" name="image1.jpg"/>
+                    <pic:cNvPicPr preferRelativeResize="0"/>
+                  </pic:nvPicPr>
+                  <pic:blipFill>
+                    <a:blip r:embed="rId5"/>
+                    <a:srcRect/>
+                    <a:stretch>
+                      <a:fillRect/>
+                    </a:stretch>
+                  </pic:blipFill>
+                  <pic:spPr>
+                    <a:xfrm>
+                      <a:off x="0" y="0"/>
+                      <a:ext cx="3148013" cy="1796373"/>
+                    </a:xfrm>
+                    <a:prstGeom prst="rect">
+                      <a:avLst/>
+                    </a:prstGeom>
+                    <a:ln/>
+                  </pic:spPr>
+                </pic:pic>
+              </a:graphicData>
+            </a:graphic>
+          </wp:inline>
+        </w:drawing>
+      </w:r>
+    </w:p>
+    <w:p>
+      <w:pPr>
+        <w:jc w:val="center"/>
+      </w:pPr>
+      <w:r>
+        <w:t>Figure X: Screenshot of Error Handling</w:t>
+      </w:r>
+    </w:p>
+    <w:p>
+      <w:pPr>
+        <w:jc w:val="center"/>
+      </w:pPr>
+    </w:p>
+    <w:p>
+      <w:r>
+        <w:rPr>
+          <w:lang w:val="en-US"/>
+        </w:rPr>
+        <w:t>Lorem ipsum dolor sit amet, consectetur adipiscing elit, sed do eiusmod tempor incididunt ut labore et dolore magna aliqua. Ut enim ad minim veniam, quis nostrud exercitation ullamco laboris nisi ut aliquip ex ea commodo consequat. Duis aute irure dolor in reprehenderit in voluptate velit esse cillum dolore eu fugiat nulla pariatur. Excepteur sint occaecat cupidatat non proident, sunt in culpa qui officia deserunt mollit anim id est laborum.</w:t>
+      </w:r>
+    </w:p>
     <w:p/>
     <w:p/>
     <w:p/>
@@ -1596,6 +2938,30 @@
       <w:u w:val="single"/>
     </w:rPr>
   </w:style>
+  <w:style w:type="character" w:styleId="UnresolvedMention">
+    <w:name w:val="Unresolved Mention"/>
+    <w:basedOn w:val="DefaultParagraphFont"/>
+    <w:uiPriority w:val="99"/>
+    <w:semiHidden/>
+    <w:unhideWhenUsed/>
+    <w:rsid w:val="009C4287"/>
+    <w:rPr>
+      <w:color w:val="605E5C"/>
+      <w:shd w:val="clear" w:color="auto" w:fill="E1DFDD"/>
+    </w:rPr>
+  </w:style>
+  <w:style w:type="character" w:styleId="FollowedHyperlink">
+    <w:name w:val="FollowedHyperlink"/>
+    <w:basedOn w:val="DefaultParagraphFont"/>
+    <w:uiPriority w:val="99"/>
+    <w:semiHidden/>
+    <w:unhideWhenUsed/>
+    <w:rsid w:val="00F34B64"/>
+    <w:rPr>
+      <w:color w:val="800080" w:themeColor="followedHyperlink"/>
+      <w:u w:val="single"/>
+    </w:rPr>
+  </w:style>
 </w:styles>
 </file>
 

</xml_diff>